<commit_message>
update wisdom stories from revised Word sources
Co-authored-by: Cursor <cursoragent@cursor.com>
</commit_message>
<xml_diff>
--- a/ky/wisdom-stories/aging.docx
+++ b/ky/wisdom-stories/aging.docx
@@ -3,97 +3,38 @@
 <w:document xmlns:wpc="http://schemas.microsoft.com/office/word/2010/wordprocessingCanvas" xmlns:cx="http://schemas.microsoft.com/office/drawing/2014/chartex" xmlns:cx1="http://schemas.microsoft.com/office/drawing/2015/9/8/chartex" xmlns:cx2="http://schemas.microsoft.com/office/drawing/2015/10/21/chartex" xmlns:cx3="http://schemas.microsoft.com/office/drawing/2016/5/9/chartex" xmlns:cx4="http://schemas.microsoft.com/office/drawing/2016/5/10/chartex" xmlns:cx5="http://schemas.microsoft.com/office/drawing/2016/5/11/chartex" xmlns:cx6="http://schemas.microsoft.com/office/drawing/2016/5/12/chartex" xmlns:cx7="http://schemas.microsoft.com/office/drawing/2016/5/13/chartex" xmlns:cx8="http://schemas.microsoft.com/office/drawing/2016/5/14/chartex" xmlns:mc="http://schemas.openxmlformats.org/markup-compatibility/2006" xmlns:aink="http://schemas.microsoft.com/office/drawing/2016/ink" xmlns:am3d="http://schemas.microsoft.com/office/drawing/2017/model3d" xmlns:o="urn:schemas-microsoft-com:office:office" xmlns:oel="http://schemas.microsoft.com/office/2019/extlst" xmlns:r="http://schemas.openxmlformats.org/officeDocument/2006/relationships" xmlns:m="http://schemas.openxmlformats.org/officeDocument/2006/math" xmlns:v="urn:schemas-microsoft-com:vml" xmlns:wp14="http://schemas.microsoft.com/office/word/2010/wordprocessingDrawing" xmlns:wp="http://schemas.openxmlformats.org/drawingml/2006/wordprocessingDrawing" xmlns:w10="urn:schemas-microsoft-com:office:word" xmlns:w="http://schemas.openxmlformats.org/wordprocessingml/2006/main" xmlns:w14="http://schemas.microsoft.com/office/word/2010/wordml" xmlns:w15="http://schemas.microsoft.com/office/word/2012/wordml" xmlns:w16cex="http://schemas.microsoft.com/office/word/2018/wordml/cex" xmlns:w16cid="http://schemas.microsoft.com/office/word/2016/wordml/cid" xmlns:w16="http://schemas.microsoft.com/office/word/2018/wordml" xmlns:w16du="http://schemas.microsoft.com/office/word/2023/wordml/word16du" xmlns:w16sdtdh="http://schemas.microsoft.com/office/word/2020/wordml/sdtdatahash" xmlns:w16sdtfl="http://schemas.microsoft.com/office/word/2024/wordml/sdtformatlock" xmlns:w16se="http://schemas.microsoft.com/office/word/2015/wordml/symex" xmlns:wpg="http://schemas.microsoft.com/office/word/2010/wordprocessingGroup" xmlns:wpi="http://schemas.microsoft.com/office/word/2010/wordprocessingInk" xmlns:wne="http://schemas.microsoft.com/office/word/2006/wordml" xmlns:wps="http://schemas.microsoft.com/office/word/2010/wordprocessingShape" mc:Ignorable="w14 w15 w16se w16cid w16 w16cex w16sdtdh w16sdtfl w16du wp14">
   <w:body>
     <w:p>
-      <w:pPr>
-        <w:pStyle w:val="Title"/>
-        <w:keepNext/>
-        <w:keepLines w:val="0"/>
-        <w:pageBreakBefore w:val="0"/>
-        <w:widowControl/>
-        <w:spacing w:line="269" w:lineRule="auto" w:after="180" w:before="0"/>
-      </w:pPr>
-      <w:bookmarkStart w:id="10001" w:name="Story_2"/>
       <w:r>
         <w:rPr>
-          <w:rFonts w:ascii="Arial" w:hAnsi="Arial"/>
           <w:b/>
-          <w:color w:val="000000"/>
-          <w:sz w:val="34"/>
-          <w:lang w:val="ky-KG"/>
+          <w:bCs/>
         </w:rPr>
         <w:t>Жашка толуу</w:t>
       </w:r>
-      <w:bookmarkEnd w:id="10001"/>
     </w:p>
     <w:p>
-      <w:pPr>
-        <w:keepNext/>
-        <w:keepLines w:val="0"/>
-        <w:pageBreakBefore w:val="0"/>
-        <w:widowControl/>
-        <w:spacing w:line="269" w:lineRule="auto" w:after="120" w:before="0"/>
-      </w:pPr>
       <w:r>
-        <w:rPr>
-          <w:rFonts w:ascii="Arial" w:eastAsia="Arial" w:hAnsi="Arial"/>
-          <w:color w:val="000000"/>
-          <w:sz w:val="22"/>
-          <w:lang w:val="ky-KG"/>
-        </w:rPr>
-        <w:t>Жашка толуу тоого чыкканга окшош: жогорулаган сайын чарчооң күчөп, демиң кысылат, бирок дүйнөгө болгон көз карашың кеңейет.</w:t>
+        <w:t>Жаштын өтүшү тоого чыгууга окшош: бийиктеген сайын кадамың оорлоп, демиң кысылат, бирок көз алдыңда улам кеңири мейкиндик ачылат.</w:t>
       </w:r>
     </w:p>
     <w:p>
-      <w:pPr>
-        <w:pStyle w:val="Moral"/>
-        <w:keepNext/>
-        <w:keepLines/>
-        <w:pageBreakBefore w:val="0"/>
-        <w:widowControl/>
-        <w:spacing w:before="120" w:after="120" w:line="269" w:lineRule="auto"/>
-        <w:ind w:left="240" w:right="240"/>
-        <w:rPr>
-          <w:lang/>
-        </w:rPr>
-      </w:pPr>
       <w:r>
         <w:rPr>
-          <w:rFonts w:ascii="Arial" w:hAnsi="Arial"/>
           <w:b/>
-          <w:color w:val="000000"/>
-          <w:sz w:val="22"/>
-          <w:lang w:val="ky-KG"/>
+          <w:bCs/>
         </w:rPr>
-        <w:t>Сабак: Жаш өткөн сайын адамдын күчү кемигени менен, көргөн-билгени көбөйүп, жашоого болгон көз карашы кеңейет.</w:t>
-      </w:r>
-      <w:r>
-        <w:rPr>
-          <w:rFonts w:ascii="Arial" w:hAnsi="Arial"/>
-          <w:color w:val="000000"/>
-          <w:sz w:val="22"/>
-          <w:lang w:val="ky-KG"/>
-        </w:rPr>
+        <w:t>Сабак: Жылдар өткөн сайын күчүбүз азайышы мүмкүн, бирок топтогон тажрыйбабыз алысты көрө билүүгө, жашоону тереңирээк түшүнүүгө үйрөтөт.</w:t>
       </w:r>
     </w:p>
     <w:p>
-      <w:pPr>
-        <w:keepNext w:val="0"/>
-        <w:keepLines w:val="0"/>
-        <w:pageBreakBefore w:val="0"/>
-        <w:widowControl/>
-        <w:spacing w:before="0" w:after="160" w:line="269" w:lineRule="auto"/>
-        <w:jc w:val="right"/>
-      </w:pPr>
       <w:r>
         <w:rPr>
-          <w:rFonts w:ascii="Arial" w:eastAsia="Arial" w:hAnsi="Arial" w:cs="Arial"/>
           <w:i/>
-          <w:color w:val="000000"/>
-          <w:sz w:val="18"/>
-          <w:lang w:val="ky-KG"/>
+          <w:iCs/>
         </w:rPr>
-        <w:t>Аңгемелер ачык интернет булактарынан алынган, иллюстрациялар болсо ЖИ менен түзүлгөн.</w:t>
+        <w:t>Аңгемелер интернеттен чогултулуп, жасалма интеллекттин жардамы менен иштелип чыккан. Бардык сүрөттөр жасалма интеллект аркылуу түзүлгөн.</w:t>
       </w:r>
     </w:p>
+    <w:p/>
     <w:sectPr>
       <w:headerReference w:type="even" r:id="rId7"/>
       <w:headerReference w:type="default" r:id="rId8"/>
@@ -924,7 +865,6 @@
     </w:pPr>
     <w:rPr>
       <w:rFonts w:asciiTheme="majorHAnsi" w:eastAsiaTheme="majorEastAsia" w:hAnsiTheme="majorHAnsi" w:cstheme="majorBidi"/>
-      <w:color w:val="000000"/>
       <w:sz w:val="40"/>
       <w:szCs w:val="40"/>
     </w:rPr>
@@ -946,7 +886,6 @@
     </w:pPr>
     <w:rPr>
       <w:rFonts w:asciiTheme="majorHAnsi" w:eastAsiaTheme="majorEastAsia" w:hAnsiTheme="majorHAnsi" w:cstheme="majorBidi"/>
-      <w:color w:val="000000"/>
       <w:sz w:val="32"/>
       <w:szCs w:val="32"/>
     </w:rPr>
@@ -969,7 +908,6 @@
     </w:pPr>
     <w:rPr>
       <w:rFonts w:eastAsiaTheme="majorEastAsia" w:cstheme="majorBidi"/>
-      <w:color w:val="000000"/>
       <w:sz w:val="28"/>
       <w:szCs w:val="28"/>
     </w:rPr>
@@ -994,7 +932,6 @@
       <w:rFonts w:eastAsiaTheme="majorEastAsia" w:cstheme="majorBidi"/>
       <w:i/>
       <w:iCs/>
-      <w:color w:val="000000"/>
     </w:rPr>
   </w:style>
   <w:style w:type="paragraph" w:styleId="Heading5">
@@ -1015,7 +952,6 @@
     </w:pPr>
     <w:rPr>
       <w:rFonts w:eastAsiaTheme="majorEastAsia" w:cstheme="majorBidi"/>
-      <w:color w:val="000000"/>
     </w:rPr>
   </w:style>
   <w:style w:type="paragraph" w:styleId="Heading6">
@@ -1038,7 +974,6 @@
       <w:rFonts w:eastAsiaTheme="majorEastAsia" w:cstheme="majorBidi"/>
       <w:i/>
       <w:iCs/>
-      <w:color w:val="000000"/>
     </w:rPr>
   </w:style>
   <w:style w:type="paragraph" w:styleId="Heading7">
@@ -1059,7 +994,6 @@
     </w:pPr>
     <w:rPr>
       <w:rFonts w:eastAsiaTheme="majorEastAsia" w:cstheme="majorBidi"/>
-      <w:color w:val="000000"/>
     </w:rPr>
   </w:style>
   <w:style w:type="paragraph" w:styleId="Heading8">
@@ -1082,7 +1016,6 @@
       <w:rFonts w:eastAsiaTheme="majorEastAsia" w:cstheme="majorBidi"/>
       <w:i/>
       <w:iCs/>
-      <w:color w:val="000000"/>
     </w:rPr>
   </w:style>
   <w:style w:type="paragraph" w:styleId="Heading9">
@@ -1103,13 +1036,11 @@
     </w:pPr>
     <w:rPr>
       <w:rFonts w:eastAsiaTheme="majorEastAsia" w:cstheme="majorBidi"/>
-      <w:color w:val="000000"/>
     </w:rPr>
   </w:style>
   <w:style w:type="character" w:default="1" w:styleId="DefaultParagraphFont">
     <w:name w:val="Default Paragraph Font"/>
     <w:uiPriority w:val="1"/>
-    <w:semiHidden/>
     <w:unhideWhenUsed/>
   </w:style>
   <w:style w:type="table" w:default="1" w:styleId="TableNormal">
@@ -1265,7 +1196,6 @@
     </w:pPr>
     <w:rPr>
       <w:rFonts w:asciiTheme="majorHAnsi" w:eastAsiaTheme="majorEastAsia" w:hAnsiTheme="majorHAnsi" w:cstheme="majorBidi"/>
-      <w:color w:val="000000"/>
       <w:spacing w:val="-10"/>
       <w:kern w:val="28"/>
       <w:sz w:val="56"/>
@@ -1301,7 +1231,6 @@
     </w:pPr>
     <w:rPr>
       <w:rFonts w:eastAsiaTheme="majorEastAsia" w:cstheme="majorBidi"/>
-      <w:color w:val="000000"/>
       <w:spacing w:val="15"/>
       <w:sz w:val="28"/>
       <w:szCs w:val="28"/>
@@ -1336,7 +1265,6 @@
     <w:rPr>
       <w:i/>
       <w:iCs/>
-      <w:color w:val="000000"/>
     </w:rPr>
   </w:style>
   <w:style w:type="character" w:customStyle="1" w:styleId="QuoteChar">
@@ -1361,9 +1289,6 @@
       <w:ind w:left="720"/>
       <w:contextualSpacing/>
     </w:pPr>
-    <w:rPr>
-      <w:color w:val="000000"/>
-    </w:rPr>
   </w:style>
   <w:style w:type="character" w:styleId="IntenseEmphasis">
     <w:name w:val="Intense Emphasis"/>
@@ -1393,7 +1318,6 @@
     <w:rPr>
       <w:i/>
       <w:iCs/>
-      <w:color w:val="000000"/>
     </w:rPr>
   </w:style>
   <w:style w:type="character" w:customStyle="1" w:styleId="IntenseQuoteChar">
@@ -1433,9 +1357,6 @@
     <w:pPr>
       <w:spacing w:after="100"/>
     </w:pPr>
-    <w:rPr>
-      <w:color w:val="000000"/>
-    </w:rPr>
   </w:style>
   <w:style w:type="paragraph" w:customStyle="1" w:styleId="Moral">
     <w:name w:val="Moral"/>
@@ -1447,7 +1368,6 @@
     <w:rPr>
       <w:rFonts w:ascii="Arial" w:eastAsia="Arial" w:hAnsi="Arial"/>
       <w:i/>
-      <w:color w:val="000000"/>
       <w:kern w:val="0"/>
       <w:sz w:val="22"/>
       <w:szCs w:val="22"/>
@@ -1469,9 +1389,6 @@
       </w:tabs>
       <w:spacing w:after="0" w:line="240" w:lineRule="auto"/>
     </w:pPr>
-    <w:rPr>
-      <w:color w:val="000000"/>
-    </w:rPr>
   </w:style>
   <w:style w:type="character" w:customStyle="1" w:styleId="HeaderChar">
     <w:name w:val="Header Char"/>
@@ -1494,9 +1411,6 @@
       </w:tabs>
       <w:spacing w:after="0" w:line="240" w:lineRule="auto"/>
     </w:pPr>
-    <w:rPr>
-      <w:color w:val="000000"/>
-    </w:rPr>
   </w:style>
   <w:style w:type="character" w:customStyle="1" w:styleId="FooterChar">
     <w:name w:val="Footer Char"/>
@@ -1519,7 +1433,6 @@
     </w:pPr>
     <w:rPr>
       <w:rFonts w:eastAsiaTheme="minorEastAsia"/>
-      <w:color w:val="000000"/>
     </w:rPr>
   </w:style>
   <w:style w:type="paragraph" w:styleId="TOC3">
@@ -1536,7 +1449,6 @@
     </w:pPr>
     <w:rPr>
       <w:rFonts w:eastAsiaTheme="minorEastAsia"/>
-      <w:color w:val="000000"/>
     </w:rPr>
   </w:style>
   <w:style w:type="paragraph" w:styleId="TOC4">
@@ -1553,7 +1465,6 @@
     </w:pPr>
     <w:rPr>
       <w:rFonts w:eastAsiaTheme="minorEastAsia"/>
-      <w:color w:val="000000"/>
     </w:rPr>
   </w:style>
   <w:style w:type="paragraph" w:styleId="TOC5">
@@ -1570,7 +1481,6 @@
     </w:pPr>
     <w:rPr>
       <w:rFonts w:eastAsiaTheme="minorEastAsia"/>
-      <w:color w:val="000000"/>
     </w:rPr>
   </w:style>
   <w:style w:type="paragraph" w:styleId="TOC6">
@@ -1587,7 +1497,6 @@
     </w:pPr>
     <w:rPr>
       <w:rFonts w:eastAsiaTheme="minorEastAsia"/>
-      <w:color w:val="000000"/>
     </w:rPr>
   </w:style>
   <w:style w:type="paragraph" w:styleId="TOC7">
@@ -1604,7 +1513,6 @@
     </w:pPr>
     <w:rPr>
       <w:rFonts w:eastAsiaTheme="minorEastAsia"/>
-      <w:color w:val="000000"/>
     </w:rPr>
   </w:style>
   <w:style w:type="paragraph" w:styleId="TOC8">
@@ -1621,7 +1529,6 @@
     </w:pPr>
     <w:rPr>
       <w:rFonts w:eastAsiaTheme="minorEastAsia"/>
-      <w:color w:val="000000"/>
     </w:rPr>
   </w:style>
   <w:style w:type="paragraph" w:styleId="TOC9">
@@ -1638,7 +1545,6 @@
     </w:pPr>
     <w:rPr>
       <w:rFonts w:eastAsiaTheme="minorEastAsia"/>
-      <w:color w:val="000000"/>
     </w:rPr>
   </w:style>
   <w:style w:type="paragraph" w:styleId="TOCHeading">
@@ -1654,7 +1560,6 @@
       <w:outlineLvl w:val="9"/>
     </w:pPr>
     <w:rPr>
-      <w:color w:val="000000"/>
       <w:kern w:val="0"/>
       <w:sz w:val="32"/>
       <w:szCs w:val="32"/>

</xml_diff>